<commit_message>
Say in the handover that Git is enough to change the draft.
Vercel is a second window, not a missing key. The logo is a file in this branch, and the steps to replace it do not need a Vercel login.

Co-authored-by: DanLejerskar <DanLejerskar@users.noreply.github.com>
</commit_message>
<xml_diff>
--- a/eon-product-overview/COVER-EMAIL-BOTS.docx
+++ b/eon-product-overview/COVER-EMAIL-BOTS.docx
@@ -87,17 +87,22 @@
     </w:p>
     <w:p>
       <w:r>
-        <w:t>Give this file to your agents and let them do the work. Do not paste the pages in by hand.</w:t>
+        <w:t>You do not need Vercel. The website is already in Git. Change a file, push the branch, and the HTML preview updates. The logo is one picture: eon-product-overview/assets/brand/eon-reality-logo-white.png. Replace that file. You do not open Vercel to do it. The logo that could not be changed before is on a different site, https://eon-education-government-review.vercel.app/. That site is not this folder.</w:t>
       </w:r>
     </w:p>
     <w:p>
       <w:r>
-        <w:t>eon-product-overview/BOT-BRIEF-RAUL-BRITA.md</w:t>
+        <w:t>Hand your agent one file:</w:t>
       </w:r>
     </w:p>
     <w:p>
       <w:r>
-        <w:t>The same brief is also BOT-BRIEF-RAUL-BRITA.docx. The locked product rules are still in HANDOVER.md.</w:t>
+        <w:t>eon-product-overview/HANDOVER.md</w:t>
+      </w:r>
+    </w:p>
+    <w:p>
+      <w:r>
+        <w:t>The same note is HANDOVER.docx. Section 2a says Git is enough, and it has the logo steps. The longer cross-check is BOT-BRIEF-RAUL-BRITA.md if the agent needs the gap list.</w:t>
       </w:r>
     </w:p>
     <w:p>

</xml_diff>

<commit_message>
List the long story pages in the handover.
Learn, then Universal, then Open the long story, goes to the Universal page on the long platform. The handover now lists all 22 of those pages.

Co-authored-by: DanLejerskar <DanLejerskar@users.noreply.github.com>
</commit_message>
<xml_diff>
--- a/eon-product-overview/COVER-EMAIL-BOTS.docx
+++ b/eon-product-overview/COVER-EMAIL-BOTS.docx
@@ -88,6 +88,11 @@
     <w:p>
       <w:r>
         <w:t>You do not need Vercel. The website is already in Git. Change a file, push the branch, and the HTML preview updates. The logo is one picture: eon-product-overview/assets/brand/eon-reality-logo-white.png. Replace that file. You do not open Vercel to do it. The logo that could not be changed before is on a different site, https://eon-education-government-review.vercel.app/. That site is not this folder.</w:t>
+      </w:r>
+    </w:p>
+    <w:p>
+      <w:r>
+        <w:t>The long story is already linked. On Learn, open Universal, then Open the long story. That page is https://eon-education-government-review.vercel.app/products/universal.html. The other 21 long stories are listed in HANDOVER.md section 6a. Leave those pages where they are. This draft does not contain their source.</w:t>
       </w:r>
     </w:p>
     <w:p>

</xml_diff>

<commit_message>
Add WordPress content pages for Elementor.
Each page is the hero through the last section, with styles scoped to that page, so marketing can paste it under the existing header and footer.

Co-authored-by: DanLejerskar <DanLejerskar@users.noreply.github.com>
</commit_message>
<xml_diff>
--- a/eon-product-overview/COVER-EMAIL-BOTS.docx
+++ b/eon-product-overview/COVER-EMAIL-BOTS.docx
@@ -4,7 +4,7 @@
   <w:body>
     <w:p>
       <w:pPr>
-        <w:pStyle w:val="Title"/>
+        <w:pStyle w:val="Heading1"/>
       </w:pPr>
       <w:r>
         <w:t>Cover email</w:t>
@@ -32,7 +32,7 @@
     </w:p>
     <w:p>
       <w:r>
-        <w:t>To: Raul and Brita</w:t>
+        <w:t>To: Raul, Brita, and the marketing team</w:t>
       </w:r>
     </w:p>
     <w:p>
@@ -107,7 +107,12 @@
     </w:p>
     <w:p>
       <w:r>
-        <w:t>The same note is HANDOVER.docx. Section 2a says Git is enough, and it has the logo steps. The longer cross-check is BOT-BRIEF-RAUL-BRITA.md if the agent needs the gap list.</w:t>
+        <w:t>The same note is HANDOVER.docx. Section 2a says Git is enough, and it has the logo steps. Section 2b is for marketing. The longer cross-check is BOT-BRIEF-RAUL-BRITA.md if the agent needs the gap list.</w:t>
+      </w:r>
+    </w:p>
+    <w:p>
+      <w:r>
+        <w:t>Marketing: the zip also has a wordpress folder. Each page is content only, from the hero through the last section. Paste the HTML into the Elementor HTML widget. Load the CSS file with the same name on that page only. Do not add a header, a menu, a logo bar, or a footer. Elementor Pro already has those. Do not replace the existing forms, event registration, or the Radar CRM. These files have none of that.</w:t>
       </w:r>
     </w:p>
     <w:p>

</xml_diff>